<commit_message>
Fix prose defects in both books: remove spliced foreign words, rewrap lines
</commit_message>
<xml_diff>
--- a/deep-vs-shallow/out/Deep-Work-vs-Shallow-Work.docx
+++ b/deep-vs-shallow/out/Deep-Work-vs-Shallow-Work.docx
@@ -5926,7 +5926,7 @@
           <w:sz w:val="20"/>
           <w:szCs w:val="20"/>
         </w:rPr>
-        <w:t xml:space="preserve">Memblokir waktu di kalender sudah lama dilakukan di berbagai tim kerja sudah lama ada, tetapi hampir selalu diperlakukan sebagai hal sementara. Ketika ada yang membatalkan, blok itu dihapus begitu saja dan tidak pernah diisi ulang. Akibatnya, kalender terlihat penuh dengan blok yang tidak pernah benar terpakai, dan kalender itu memberi rasa produktif tanpa hasil yang nyata.</w:t>
+        <w:t xml:space="preserve">Memblokir waktu di kalender sudah lama dilakukan di berbagai tim kerja, tetapi hampir selalu diperlakukan sebagai hal sementara. Ketika ada yang membatalkan, blok itu dihapus begitu saja dan tidak pernah diisi ulang. Akibatnya, kalender terlihat penuh dengan blok yang tidak pernah benar terpakai, dan kalender itu memberi rasa produktif tanpa hasil yang nyata.</w:t>
       </w:r>
     </w:p>
     <w:p>
@@ -13976,7 +13976,7 @@
           <w:sz w:val="20"/>
           <w:szCs w:val="20"/>
         </w:rPr>
-        <w:t xml:space="preserve">Apakah blok kerja kamu terlihat di kalender orang lain, atau hanya di kepala kamu sendiri. Kalau kalender itu kosong di tempat yang seharusnya terisi, masalahnya bukan disiplin, melainkan planning.</w:t>
+        <w:t xml:space="preserve">Apakah blok kerja kamu terlihat di kalender orang lain, atau hanya di kepala kamu sendiri. Kalau kalender itu kosong di tempat yang seharusnya terisi, masalahnya bukan disiplin, melainkan perencanaan.</w:t>
       </w:r>
     </w:p>
     <w:p>
@@ -13991,7 +13991,7 @@
           <w:sz w:val="20"/>
           <w:szCs w:val="20"/>
         </w:rPr>
-        <w:t xml:space="preserve">Kalau semua notifikasi dimatikan selama empat jam, apakah ada pekerjaan yang benar-benar tertunda, atau justru tidak ada yang hilang sama sekali. Kalau tidak ada yang hilang, maka waktu yang selama ini kamu kira hilang untuk deep work sebenarnya sedang terpakai untuk hal yang tidak perlu waited_for.</w:t>
+        <w:t xml:space="preserve">Kalau semua notifikasi dimatikan selama empat jam, apakah ada pekerjaan yang benar-benar tertunda, atau justru tidak ada yang hilang sama sekali. Kalau tidak ada yang hilang, maka waktu yang selama ini kamu kira hilang untuk deep work sebenarnya sedang terpakai untuk hal yang tidak perlu ditunggu.</w:t>
       </w:r>
     </w:p>
     <w:p>

</xml_diff>